<commit_message>
vault backup: 2026-04-24 16:51:40
</commit_message>
<xml_diff>
--- a/dev/10 Projects/AZT/07_output/agency/AZT — Пример заполненного отчёта 20-24.04.docx
+++ b/dev/10 Projects/AZT/07_output/agency/AZT — Пример заполненного отчёта 20-24.04.docx
@@ -1895,7 +1895,7 @@
                 <w:szCs w:val="24"/>
                 <w:lang w:val="en-US" w:eastAsia="en-US" w:bidi="ar-SA"/>
               </w:rPr>
-              <w:t>❌</w:t>
+              <w:t>Работа ведётся</w:t>
             </w:r>
           </w:p>
         </w:tc>
@@ -2352,7 +2352,9 @@
         </w:tc>
       </w:tr>
       <w:tr>
-        <w:trPr/>
+        <w:trPr>
+          <w:trHeight w:val="1239" w:hRule="atLeast"/>
+        </w:trPr>
         <w:tc>
           <w:tcPr>
             <w:tcW w:w="450" w:type="dxa"/>
@@ -2462,7 +2464,27 @@
                 <w:szCs w:val="24"/>
                 <w:lang w:val="en-US" w:eastAsia="en-US" w:bidi="ar-SA"/>
               </w:rPr>
-              <w:t>❓</w:t>
+              <w:t>Откладываем до “</w:t>
+            </w:r>
+            <w:r>
+              <w:rPr>
+                <w:rFonts w:eastAsia="Cambria" w:cs=""/>
+                <w:kern w:val="0"/>
+                <w:sz w:val="24"/>
+                <w:szCs w:val="24"/>
+                <w:lang w:val="en-US" w:eastAsia="en-US" w:bidi="ar-SA"/>
+              </w:rPr>
+              <w:t>после майских”</w:t>
+            </w:r>
+            <w:r>
+              <w:rPr>
+                <w:rFonts w:eastAsia="Cambria" w:cs=""/>
+                <w:kern w:val="0"/>
+                <w:sz w:val="24"/>
+                <w:szCs w:val="24"/>
+                <w:lang w:val="en-US" w:eastAsia="en-US" w:bidi="ar-SA"/>
+              </w:rPr>
+              <w:t>.</w:t>
             </w:r>
           </w:p>
         </w:tc>
@@ -20573,7 +20595,11 @@
       </w:r>
       <w:r>
         <w:rPr/>
-        <w:t>)</w:t>
+        <w:t xml:space="preserve">) - </w:t>
+      </w:r>
+      <w:r>
+        <w:rPr/>
+        <w:t>нет</w:t>
       </w:r>
     </w:p>
     <w:p>
@@ -20597,7 +20623,11 @@
       </w:r>
       <w:r>
         <w:rPr/>
-        <w:t>)</w:t>
+        <w:t xml:space="preserve">) </w:t>
+      </w:r>
+      <w:r>
+        <w:rPr/>
+        <w:t>делаем</w:t>
       </w:r>
     </w:p>
     <w:p>
@@ -20611,7 +20641,11 @@
       </w:pPr>
       <w:r>
         <w:rPr/>
-        <w:t>Возрастные корректировки 35+ в 4 ЕПК</w:t>
+        <w:t xml:space="preserve">Возрастные корректировки 35+ в 4 ЕПК </w:t>
+      </w:r>
+      <w:r>
+        <w:rPr/>
+        <w:t>делаем</w:t>
       </w:r>
     </w:p>
     <w:p>
@@ -20631,7 +20665,11 @@
       </w:r>
       <w:r>
         <w:rPr/>
-        <w:t xml:space="preserve"> в 4 ЕПК</w:t>
+        <w:t xml:space="preserve"> в 4 ЕПК </w:t>
+      </w:r>
+      <w:r>
+        <w:rPr/>
+        <w:t>не трогаем</w:t>
       </w:r>
     </w:p>
     <w:p>
@@ -20675,7 +20713,11 @@
       </w:r>
       <w:r>
         <w:rPr/>
-        <w:t>) — целевые или корректировочные</w:t>
+        <w:t xml:space="preserve">) — целевые или корректировочные </w:t>
+      </w:r>
+      <w:r>
+        <w:rPr/>
+        <w:t>делаем</w:t>
       </w:r>
     </w:p>
     <w:p>
@@ -20709,7 +20751,11 @@
       </w:r>
       <w:r>
         <w:rPr/>
-        <w:t xml:space="preserve"> (после обсуждения критериев)</w:t>
+        <w:t xml:space="preserve"> (после обсуждения критериев) – </w:t>
+      </w:r>
+      <w:r>
+        <w:rPr/>
+        <w:t>на усмотрение ММ</w:t>
       </w:r>
     </w:p>
     <w:p>
@@ -20743,7 +20789,11 @@
       </w:r>
       <w:r>
         <w:rPr/>
-        <w:t>) после согласования двухуровневых критериев</w:t>
+        <w:t xml:space="preserve">) после согласования двухуровневых критериев – </w:t>
+      </w:r>
+      <w:r>
+        <w:rPr/>
+        <w:t>согласовано, только на сроках</w:t>
       </w:r>
     </w:p>
     <w:p>
@@ -20794,7 +20844,11 @@
       </w:r>
       <w:r>
         <w:rPr/>
-        <w:t xml:space="preserve"> URL)</w:t>
+        <w:t xml:space="preserve"> URL) - д</w:t>
+      </w:r>
+      <w:r>
+        <w:rPr/>
+        <w:t>елаем</w:t>
       </w:r>
     </w:p>
     <w:p>
@@ -20845,7 +20899,11 @@
       </w:r>
       <w:r>
         <w:rPr/>
-        <w:t xml:space="preserve"> URL для пула посадочных (черновик к 25.04)</w:t>
+        <w:t xml:space="preserve"> URL для пула посадочных (черновик к 25.04) – </w:t>
+      </w:r>
+      <w:r>
+        <w:rPr/>
+        <w:t>на стороне ММ</w:t>
       </w:r>
     </w:p>
     <w:p>

</xml_diff>